<commit_message>
update on Academic surge computer
</commit_message>
<xml_diff>
--- a/China/CT/HL3-MIR光学设计.docx
+++ b/China/CT/HL3-MIR光学设计.docx
@@ -15,7 +15,7 @@
     </w:p>
     <w:p>
       <w:pPr>
-        <w:pStyle w:val="a9"/>
+        <w:pStyle w:val="ListParagraph"/>
         <w:numPr>
           <w:ilvl w:val="0"/>
           <w:numId w:val="1"/>
@@ -30,7 +30,7 @@
     </w:p>
     <w:p>
       <w:pPr>
-        <w:pStyle w:val="a9"/>
+        <w:pStyle w:val="ListParagraph"/>
         <w:numPr>
           <w:ilvl w:val="0"/>
           <w:numId w:val="1"/>
@@ -45,7 +45,7 @@
     </w:p>
     <w:p>
       <w:pPr>
-        <w:pStyle w:val="a9"/>
+        <w:pStyle w:val="ListParagraph"/>
         <w:numPr>
           <w:ilvl w:val="0"/>
           <w:numId w:val="1"/>
@@ -60,7 +60,7 @@
     </w:p>
     <w:p>
       <w:pPr>
-        <w:pStyle w:val="a9"/>
+        <w:pStyle w:val="ListParagraph"/>
         <w:numPr>
           <w:ilvl w:val="0"/>
           <w:numId w:val="1"/>
@@ -81,7 +81,7 @@
     </w:p>
     <w:p>
       <w:pPr>
-        <w:pStyle w:val="a9"/>
+        <w:pStyle w:val="ListParagraph"/>
         <w:numPr>
           <w:ilvl w:val="0"/>
           <w:numId w:val="1"/>
@@ -459,7 +459,7 @@
     </w:p>
     <w:p>
       <w:pPr>
-        <w:pStyle w:val="ae"/>
+        <w:pStyle w:val="Caption"/>
         <w:jc w:val="center"/>
       </w:pPr>
       <w:bookmarkStart w:id="0" w:name="_Ref220601333"/>
@@ -482,24 +482,13 @@
         <w:t>.</w:t>
       </w:r>
       <w:r>
-        <w:t xml:space="preserve"> HL</w:t>
-      </w:r>
-      <w:proofErr w:type="gramStart"/>
-      <w:r>
-        <w:t xml:space="preserve">-3 </w:t>
-      </w:r>
-      <w:r>
-        <w:rPr>
-          <w:rFonts w:hint="eastAsia"/>
-        </w:rPr>
-        <w:t>径向</w:t>
-      </w:r>
-      <w:proofErr w:type="gramEnd"/>
-      <w:r>
-        <w:rPr>
-          <w:rFonts w:hint="eastAsia"/>
-        </w:rPr>
-        <w:t>密度分布和磁场分布设置参数</w:t>
+        <w:t xml:space="preserve"> HL-3 </w:t>
+      </w:r>
+      <w:r>
+        <w:rPr>
+          <w:rFonts w:hint="eastAsia"/>
+        </w:rPr>
+        <w:t>径向密度分布和磁场分布设置参数</w:t>
       </w:r>
     </w:p>
     <w:p>
@@ -551,7 +540,7 @@
     </w:p>
     <w:p>
       <w:pPr>
-        <w:pStyle w:val="ae"/>
+        <w:pStyle w:val="Caption"/>
         <w:jc w:val="center"/>
       </w:pPr>
       <w:bookmarkStart w:id="1" w:name="_Ref220602337"/>
@@ -635,7 +624,7 @@
     </w:p>
     <w:p>
       <w:pPr>
-        <w:pStyle w:val="ae"/>
+        <w:pStyle w:val="Caption"/>
         <w:jc w:val="center"/>
       </w:pPr>
       <w:bookmarkStart w:id="2" w:name="_Ref220601908"/>
@@ -658,11 +647,7 @@
         <w:t>.</w:t>
       </w:r>
       <w:r>
-        <w:t xml:space="preserve"> HL-3 Shot#</w:t>
-      </w:r>
-      <w:proofErr w:type="gramStart"/>
-      <w:r>
-        <w:t xml:space="preserve">6680 </w:t>
+        <w:t xml:space="preserve"> HL-3 Shot#6680 </w:t>
       </w:r>
       <w:r>
         <w:rPr>
@@ -670,7 +655,6 @@
         </w:rPr>
         <w:t>,</w:t>
       </w:r>
-      <w:proofErr w:type="gramEnd"/>
       <w:r>
         <w:t>1180ms</w:t>
       </w:r>
@@ -961,7 +945,6 @@
       <w:r>
         <w:fldChar w:fldCharType="end"/>
       </w:r>
-      <w:proofErr w:type="gramStart"/>
       <w:r>
         <w:rPr>
           <w:rFonts w:hint="eastAsia"/>
@@ -971,7 +954,6 @@
       <w:r>
         <w:t>a)</w:t>
       </w:r>
-      <w:proofErr w:type="gramEnd"/>
       <w:r>
         <w:rPr>
           <w:rFonts w:hint="eastAsia"/>
@@ -1011,7 +993,6 @@
       <w:r>
         <w:fldChar w:fldCharType="end"/>
       </w:r>
-      <w:proofErr w:type="gramStart"/>
       <w:r>
         <w:rPr>
           <w:rFonts w:hint="eastAsia"/>
@@ -1019,9 +1000,119 @@
         <w:t>(</w:t>
       </w:r>
       <w:r>
-        <w:t>b)</w:t>
-      </w:r>
-      <w:proofErr w:type="gramEnd"/>
+        <w:t xml:space="preserve">b) </w:t>
+      </w:r>
+      <w:r>
+        <w:rPr>
+          <w:rFonts w:hint="eastAsia"/>
+        </w:rPr>
+        <w:t>为对应磁场分布，通过冷等离子体截止频率方程可得到截止频率分布，如图</w:t>
+      </w:r>
+      <w:r>
+        <w:fldChar w:fldCharType="begin"/>
+      </w:r>
+      <w:r>
+        <w:instrText xml:space="preserve"> </w:instrText>
+      </w:r>
+      <w:r>
+        <w:rPr>
+          <w:rFonts w:hint="eastAsia"/>
+        </w:rPr>
+        <w:instrText>REF _Ref220589824 \h</w:instrText>
+      </w:r>
+      <w:r>
+        <w:instrText xml:space="preserve"> </w:instrText>
+      </w:r>
+      <w:r>
+        <w:fldChar w:fldCharType="separate"/>
+      </w:r>
+      <w:r>
+        <w:t xml:space="preserve">Figure </w:t>
+      </w:r>
+      <w:r>
+        <w:rPr>
+          <w:noProof/>
+        </w:rPr>
+        <w:t>4</w:t>
+      </w:r>
+      <w:r>
+        <w:fldChar w:fldCharType="end"/>
+      </w:r>
+      <w:r>
+        <w:rPr>
+          <w:rFonts w:hint="eastAsia"/>
+        </w:rPr>
+        <w:t>(c</w:t>
+      </w:r>
+      <w:r>
+        <w:t>)</w:t>
+      </w:r>
+      <w:r>
+        <w:rPr>
+          <w:rFonts w:hint="eastAsia"/>
+        </w:rPr>
+        <w:t>所示。</w:t>
+      </w:r>
+      <w:r>
+        <w:fldChar w:fldCharType="begin"/>
+      </w:r>
+      <w:r>
+        <w:instrText xml:space="preserve"> </w:instrText>
+      </w:r>
+      <w:r>
+        <w:rPr>
+          <w:rFonts w:hint="eastAsia"/>
+        </w:rPr>
+        <w:instrText>REF _Ref220589824 \h</w:instrText>
+      </w:r>
+      <w:r>
+        <w:instrText xml:space="preserve"> </w:instrText>
+      </w:r>
+      <w:r>
+        <w:fldChar w:fldCharType="separate"/>
+      </w:r>
+      <w:r>
+        <w:t xml:space="preserve">Figure </w:t>
+      </w:r>
+      <w:r>
+        <w:rPr>
+          <w:noProof/>
+        </w:rPr>
+        <w:t>4</w:t>
+      </w:r>
+      <w:r>
+        <w:fldChar w:fldCharType="end"/>
+      </w:r>
+      <w:r>
+        <w:rPr>
+          <w:rFonts w:hint="eastAsia"/>
+        </w:rPr>
+        <w:t>(d</w:t>
+      </w:r>
+      <w:r>
+        <w:t xml:space="preserve">) </w:t>
+      </w:r>
+      <w:r>
+        <w:rPr>
+          <w:rFonts w:hint="eastAsia"/>
+        </w:rPr>
+        <w:t>为频率分别为</w:t>
+      </w:r>
+      <w:r>
+        <w:rPr>
+          <w:rFonts w:hint="eastAsia"/>
+        </w:rPr>
+        <w:t>6</w:t>
+      </w:r>
+      <w:r>
+        <w:t>0GH</w:t>
+      </w:r>
+      <w:r>
+        <w:rPr>
+          <w:rFonts w:hint="eastAsia"/>
+        </w:rPr>
+        <w:t>z</w:t>
+      </w:r>
       <w:r>
         <w:t xml:space="preserve"> </w:t>
       </w:r>
@@ -1029,142 +1120,16 @@
         <w:rPr>
           <w:rFonts w:hint="eastAsia"/>
         </w:rPr>
-        <w:t>为对应磁场分布，通过冷等离子体截止频率方程可得到截止频率分布，如图</w:t>
-      </w:r>
-      <w:r>
-        <w:fldChar w:fldCharType="begin"/>
-      </w:r>
-      <w:r>
-        <w:instrText xml:space="preserve"> </w:instrText>
-      </w:r>
-      <w:r>
-        <w:rPr>
-          <w:rFonts w:hint="eastAsia"/>
-        </w:rPr>
-        <w:instrText>REF _Ref220589824 \h</w:instrText>
-      </w:r>
-      <w:r>
-        <w:instrText xml:space="preserve"> </w:instrText>
-      </w:r>
-      <w:r>
-        <w:fldChar w:fldCharType="separate"/>
-      </w:r>
-      <w:r>
-        <w:t xml:space="preserve">Figure </w:t>
-      </w:r>
-      <w:r>
-        <w:rPr>
-          <w:noProof/>
-        </w:rPr>
-        <w:t>4</w:t>
-      </w:r>
-      <w:r>
-        <w:fldChar w:fldCharType="end"/>
-      </w:r>
-      <w:proofErr w:type="gramStart"/>
-      <w:r>
-        <w:rPr>
-          <w:rFonts w:hint="eastAsia"/>
-        </w:rPr>
-        <w:t>(c</w:t>
-      </w:r>
-      <w:r>
-        <w:t>)</w:t>
-      </w:r>
-      <w:proofErr w:type="gramEnd"/>
-      <w:r>
-        <w:rPr>
-          <w:rFonts w:hint="eastAsia"/>
-        </w:rPr>
-        <w:t>所示。</w:t>
-      </w:r>
-      <w:r>
-        <w:fldChar w:fldCharType="begin"/>
-      </w:r>
-      <w:r>
-        <w:instrText xml:space="preserve"> </w:instrText>
-      </w:r>
-      <w:r>
-        <w:rPr>
-          <w:rFonts w:hint="eastAsia"/>
-        </w:rPr>
-        <w:instrText>REF _Ref220589824 \h</w:instrText>
-      </w:r>
-      <w:r>
-        <w:instrText xml:space="preserve"> </w:instrText>
-      </w:r>
-      <w:r>
-        <w:fldChar w:fldCharType="separate"/>
-      </w:r>
-      <w:r>
-        <w:t xml:space="preserve">Figure </w:t>
-      </w:r>
-      <w:r>
-        <w:rPr>
-          <w:noProof/>
-        </w:rPr>
-        <w:t>4</w:t>
-      </w:r>
-      <w:r>
-        <w:fldChar w:fldCharType="end"/>
-      </w:r>
-      <w:proofErr w:type="gramStart"/>
-      <w:r>
-        <w:rPr>
-          <w:rFonts w:hint="eastAsia"/>
-        </w:rPr>
-        <w:t>(d</w:t>
-      </w:r>
-      <w:r>
-        <w:t>)</w:t>
-      </w:r>
-      <w:proofErr w:type="gramEnd"/>
-      <w:r>
+        <w:t>和</w:t>
+      </w:r>
+      <w:r>
+        <w:rPr>
+          <w:rFonts w:hint="eastAsia"/>
+        </w:rPr>
         <w:t xml:space="preserve"> </w:t>
       </w:r>
       <w:r>
-        <w:rPr>
-          <w:rFonts w:hint="eastAsia"/>
-        </w:rPr>
-        <w:t>为频率分别为</w:t>
-      </w:r>
-      <w:r>
-        <w:rPr>
-          <w:rFonts w:hint="eastAsia"/>
-        </w:rPr>
-        <w:t>6</w:t>
-      </w:r>
-      <w:r>
-        <w:t>0GH</w:t>
-      </w:r>
-      <w:r>
-        <w:rPr>
-          <w:rFonts w:hint="eastAsia"/>
-        </w:rPr>
-        <w:t>z</w:t>
-      </w:r>
-      <w:r>
-        <w:t xml:space="preserve"> </w:t>
-      </w:r>
-      <w:proofErr w:type="gramStart"/>
-      <w:r>
-        <w:rPr>
-          <w:rFonts w:hint="eastAsia"/>
-        </w:rPr>
-        <w:t>和</w:t>
-      </w:r>
-      <w:r>
-        <w:rPr>
-          <w:rFonts w:hint="eastAsia"/>
-        </w:rPr>
-        <w:t xml:space="preserve"> </w:t>
-      </w:r>
-      <w:r>
-        <w:t xml:space="preserve">80 </w:t>
-      </w:r>
-      <w:proofErr w:type="gramEnd"/>
-      <w:r>
-        <w:t>GH</w:t>
+        <w:t>80 GH</w:t>
       </w:r>
       <w:r>
         <w:rPr>
@@ -1244,7 +1209,7 @@
     </w:p>
     <w:p>
       <w:pPr>
-        <w:pStyle w:val="ae"/>
+        <w:pStyle w:val="Caption"/>
         <w:jc w:val="center"/>
       </w:pPr>
       <w:bookmarkStart w:id="3" w:name="_Ref220589824"/>
@@ -1282,40 +1247,48 @@
         <w:t>:</w:t>
       </w:r>
       <w:r>
-        <w:t>(a)</w:t>
-      </w:r>
-      <w:r>
-        <w:rPr>
-          <w:rFonts w:hint="eastAsia"/>
-        </w:rPr>
-        <w:t>磁场</w:t>
+        <w:t>(</w:t>
       </w:r>
       <w:proofErr w:type="gramStart"/>
       <w:r>
-        <w:rPr>
-          <w:rFonts w:hint="eastAsia"/>
-        </w:rPr>
-        <w:t>分布，</w:t>
-      </w:r>
-      <w:r>
+        <w:t>a)</w:t>
+      </w:r>
+      <w:r>
+        <w:rPr>
+          <w:rFonts w:hint="eastAsia"/>
+        </w:rPr>
+        <w:t>磁场分布</w:t>
+      </w:r>
+      <w:proofErr w:type="gramEnd"/>
+      <w:r>
+        <w:rPr>
+          <w:rFonts w:hint="eastAsia"/>
+        </w:rPr>
+        <w:t>，</w:t>
+      </w:r>
+      <w:r>
+        <w:t>(b)</w:t>
+      </w:r>
+      <w:r>
+        <w:rPr>
+          <w:rFonts w:hint="eastAsia"/>
+        </w:rPr>
+        <w:t>密度分布，</w:t>
+      </w:r>
+      <w:r>
+        <w:rPr>
+          <w:rFonts w:hint="eastAsia"/>
+        </w:rPr>
         <w:t>(</w:t>
       </w:r>
-      <w:proofErr w:type="gramEnd"/>
-      <w:r>
-        <w:t>b)</w:t>
-      </w:r>
-      <w:r>
-        <w:rPr>
-          <w:rFonts w:hint="eastAsia"/>
-        </w:rPr>
-        <w:t>密度</w:t>
-      </w:r>
-      <w:proofErr w:type="gramStart"/>
-      <w:r>
-        <w:rPr>
-          <w:rFonts w:hint="eastAsia"/>
-        </w:rPr>
-        <w:t>分布，</w:t>
+      <w:r>
+        <w:t>c)</w:t>
+      </w:r>
+      <w:r>
+        <w:rPr>
+          <w:rFonts w:hint="eastAsia"/>
+        </w:rPr>
+        <w:t>右旋截止频率分布，</w:t>
       </w:r>
       <w:r>
         <w:rPr>
@@ -1323,30 +1296,6 @@
         </w:rPr>
         <w:t>(</w:t>
       </w:r>
-      <w:proofErr w:type="gramEnd"/>
-      <w:r>
-        <w:t>c)</w:t>
-      </w:r>
-      <w:r>
-        <w:rPr>
-          <w:rFonts w:hint="eastAsia"/>
-        </w:rPr>
-        <w:t>右旋截止频率</w:t>
-      </w:r>
-      <w:proofErr w:type="gramStart"/>
-      <w:r>
-        <w:rPr>
-          <w:rFonts w:hint="eastAsia"/>
-        </w:rPr>
-        <w:t>分布，</w:t>
-      </w:r>
-      <w:r>
-        <w:rPr>
-          <w:rFonts w:hint="eastAsia"/>
-        </w:rPr>
-        <w:t>(</w:t>
-      </w:r>
-      <w:proofErr w:type="gramEnd"/>
       <w:r>
         <w:t xml:space="preserve">d)60GHz </w:t>
       </w:r>
@@ -1555,7 +1504,7 @@
     </w:p>
     <w:p>
       <w:pPr>
-        <w:pStyle w:val="ae"/>
+        <w:pStyle w:val="Caption"/>
         <w:jc w:val="center"/>
       </w:pPr>
       <w:bookmarkStart w:id="4" w:name="_Ref220606795"/>
@@ -1579,20 +1528,21 @@
         <w:t>.</w:t>
       </w:r>
       <w:r>
-        <w:t xml:space="preserve"> (a)z=[-0.4 0.4]m </w:t>
-      </w:r>
-      <w:r>
-        <w:rPr>
-          <w:rFonts w:hint="eastAsia"/>
-        </w:rPr>
-        <w:t>区间截止</w:t>
+        <w:t xml:space="preserve"> (a)z</w:t>
       </w:r>
       <w:proofErr w:type="gramStart"/>
       <w:r>
-        <w:rPr>
-          <w:rFonts w:hint="eastAsia"/>
-        </w:rPr>
-        <w:t>层，</w:t>
+        <w:t>=[</w:t>
+      </w:r>
+      <w:proofErr w:type="gramEnd"/>
+      <w:r>
+        <w:t xml:space="preserve">-0.4 0.4]m </w:t>
+      </w:r>
+      <w:r>
+        <w:rPr>
+          <w:rFonts w:hint="eastAsia"/>
+        </w:rPr>
+        <w:t>区间截止层，</w:t>
       </w:r>
       <w:r>
         <w:rPr>
@@ -1600,7 +1550,6 @@
         </w:rPr>
         <w:t>(</w:t>
       </w:r>
-      <w:proofErr w:type="gramEnd"/>
       <w:r>
         <w:t>b)</w:t>
       </w:r>
@@ -1745,7 +1694,7 @@
     </w:p>
     <w:p>
       <w:pPr>
-        <w:pStyle w:val="ae"/>
+        <w:pStyle w:val="Caption"/>
       </w:pPr>
       <w:r>
         <w:t xml:space="preserve">Figure </w:t>
@@ -1854,7 +1803,7 @@
     </w:p>
     <w:p>
       <w:pPr>
-        <w:pStyle w:val="ae"/>
+        <w:pStyle w:val="Caption"/>
       </w:pPr>
       <w:r>
         <w:t xml:space="preserve">Figure </w:t>
@@ -1949,7 +1898,7 @@
     </w:p>
     <w:p>
       <w:pPr>
-        <w:pStyle w:val="ae"/>
+        <w:pStyle w:val="Caption"/>
         <w:jc w:val="center"/>
       </w:pPr>
       <w:r>
@@ -1999,7 +1948,6 @@
         </w:rPr>
         <w:t>处边缘光线入射角为</w:t>
       </w:r>
-      <w:proofErr w:type="gramStart"/>
       <w:r>
         <w:rPr>
           <w:rFonts w:hint="eastAsia"/>
@@ -2010,14 +1958,7 @@
         <w:rPr>
           <w:rFonts w:hint="eastAsia"/>
         </w:rPr>
-        <w:t>度</w:t>
-      </w:r>
-      <w:proofErr w:type="gramEnd"/>
-      <w:r>
-        <w:rPr>
-          <w:rFonts w:hint="eastAsia"/>
-        </w:rPr>
-        <w:t>，</w:t>
+        <w:t>度，</w:t>
       </w:r>
     </w:p>
     <w:p>
@@ -2068,7 +2009,7 @@
     </w:p>
     <w:p>
       <w:pPr>
-        <w:pStyle w:val="ae"/>
+        <w:pStyle w:val="Caption"/>
         <w:jc w:val="center"/>
       </w:pPr>
       <w:r>
@@ -2120,26 +2061,26 @@
         </w:rPr>
         <w:t>面处光斑半径为</w:t>
       </w:r>
+      <w:r>
+        <w:rPr>
+          <w:rFonts w:hint="eastAsia"/>
+        </w:rPr>
+        <w:t xml:space="preserve">15 </w:t>
+      </w:r>
       <w:proofErr w:type="gramStart"/>
       <w:r>
         <w:rPr>
           <w:rFonts w:hint="eastAsia"/>
         </w:rPr>
-        <w:t>15 mm</w:t>
+        <w:t>mm,</w:t>
+      </w:r>
+      <w:r>
+        <w:rPr>
+          <w:rFonts w:hint="eastAsia"/>
+        </w:rPr>
+        <w:t>距离束腰位置</w:t>
       </w:r>
       <w:proofErr w:type="gramEnd"/>
-      <w:r>
-        <w:rPr>
-          <w:rFonts w:hint="eastAsia"/>
-        </w:rPr>
-        <w:t>,</w:t>
-      </w:r>
-      <w:r>
-        <w:rPr>
-          <w:rFonts w:hint="eastAsia"/>
-        </w:rPr>
-        <w:t>距离束腰位置</w:t>
-      </w:r>
       <w:r>
         <w:rPr>
           <w:rFonts w:hint="eastAsia"/>
@@ -2209,7 +2150,7 @@
     </w:p>
     <w:p>
       <w:pPr>
-        <w:pStyle w:val="ae"/>
+        <w:pStyle w:val="Caption"/>
         <w:jc w:val="center"/>
       </w:pPr>
       <w:r>
@@ -2239,7 +2180,7 @@
     <w:p/>
     <w:p>
       <w:pPr>
-        <w:pStyle w:val="a9"/>
+        <w:pStyle w:val="ListParagraph"/>
         <w:numPr>
           <w:ilvl w:val="0"/>
           <w:numId w:val="2"/>
@@ -2267,7 +2208,7 @@
     </w:p>
     <w:p>
       <w:pPr>
-        <w:pStyle w:val="a9"/>
+        <w:pStyle w:val="ListParagraph"/>
         <w:numPr>
           <w:ilvl w:val="0"/>
           <w:numId w:val="2"/>
@@ -2322,13 +2263,13 @@
     </w:p>
     <w:p>
       <w:pPr>
-        <w:pStyle w:val="a9"/>
+        <w:pStyle w:val="ListParagraph"/>
         <w:ind w:left="360"/>
       </w:pPr>
     </w:p>
     <w:p>
       <w:pPr>
-        <w:pStyle w:val="a9"/>
+        <w:pStyle w:val="ListParagraph"/>
         <w:ind w:left="360"/>
       </w:pPr>
     </w:p>
@@ -2401,7 +2342,7 @@
     </w:p>
     <w:p>
       <w:pPr>
-        <w:pStyle w:val="ae"/>
+        <w:pStyle w:val="Caption"/>
       </w:pPr>
       <w:bookmarkStart w:id="6" w:name="_Ref237895312"/>
       <w:r>
@@ -2709,7 +2650,7 @@
     </w:p>
     <w:p>
       <w:pPr>
-        <w:pStyle w:val="ae"/>
+        <w:pStyle w:val="Caption"/>
         <w:jc w:val="center"/>
       </w:pPr>
       <w:bookmarkStart w:id="7" w:name="_Ref237903592"/>
@@ -2740,7 +2681,7 @@
     </w:p>
     <w:p>
       <w:pPr>
-        <w:pStyle w:val="a9"/>
+        <w:pStyle w:val="ListParagraph"/>
         <w:ind w:left="360"/>
         <w:jc w:val="center"/>
       </w:pPr>
@@ -2792,378 +2733,364 @@
         <w:rPr>
           <w:rFonts w:hint="eastAsia"/>
         </w:rPr>
-        <w:t>(a</w:t>
+        <w:t xml:space="preserve">(a) </w:t>
+      </w:r>
+      <w:r>
+        <w:rPr>
+          <w:rFonts w:hint="eastAsia"/>
+        </w:rPr>
+        <w:t>图计算了截止层（</w:t>
+      </w:r>
+      <w:r>
+        <w:rPr>
+          <w:rFonts w:hint="eastAsia"/>
+        </w:rPr>
+        <w:t>cutoff1</w:t>
+      </w:r>
+      <w:r>
+        <w:rPr>
+          <w:rFonts w:hint="eastAsia"/>
+        </w:rPr>
+        <w:t>，距离</w:t>
+      </w:r>
+      <w:r>
+        <w:rPr>
+          <w:rFonts w:hint="eastAsia"/>
+        </w:rPr>
+        <w:t xml:space="preserve">first lens </w:t>
+      </w:r>
+      <w:r>
+        <w:rPr>
+          <w:rFonts w:hint="eastAsia"/>
+        </w:rPr>
+        <w:t>约为</w:t>
+      </w:r>
+      <w:r>
+        <w:rPr>
+          <w:rFonts w:hint="eastAsia"/>
+        </w:rPr>
+        <w:t>1.57 m</w:t>
+      </w:r>
+      <w:r>
+        <w:rPr>
+          <w:rFonts w:hint="eastAsia"/>
+        </w:rPr>
+        <w:t>）</w:t>
       </w:r>
       <w:proofErr w:type="gramStart"/>
       <w:r>
         <w:rPr>
           <w:rFonts w:hint="eastAsia"/>
         </w:rPr>
-        <w:t xml:space="preserve">) </w:t>
-      </w:r>
-      <w:r>
-        <w:rPr>
-          <w:rFonts w:hint="eastAsia"/>
-        </w:rPr>
-        <w:t>图</w:t>
+        <w:t>处光斑半径</w:t>
+      </w:r>
+      <w:r>
+        <w:rPr>
+          <w:rFonts w:hint="eastAsia"/>
+        </w:rPr>
+        <w:t>,(</w:t>
       </w:r>
       <w:proofErr w:type="gramEnd"/>
       <w:r>
         <w:rPr>
           <w:rFonts w:hint="eastAsia"/>
         </w:rPr>
-        <w:t>计算了截止层（</w:t>
-      </w:r>
-      <w:r>
-        <w:rPr>
-          <w:rFonts w:hint="eastAsia"/>
-        </w:rPr>
-        <w:t>cutoff1</w:t>
-      </w:r>
-      <w:r>
-        <w:rPr>
-          <w:rFonts w:hint="eastAsia"/>
-        </w:rPr>
-        <w:t>，距离</w:t>
-      </w:r>
+        <w:t>b)</w:t>
+      </w:r>
+      <w:proofErr w:type="gramStart"/>
+      <w:r>
+        <w:rPr>
+          <w:rFonts w:hint="eastAsia"/>
+        </w:rPr>
+        <w:t>图为截止层处最大极向接收高度</w:t>
+      </w:r>
+      <w:r>
+        <w:rPr>
+          <w:rFonts w:hint="eastAsia"/>
+        </w:rPr>
+        <w:t>,(</w:t>
+      </w:r>
+      <w:proofErr w:type="gramEnd"/>
+      <w:r>
+        <w:rPr>
+          <w:rFonts w:hint="eastAsia"/>
+        </w:rPr>
+        <w:t>c)</w:t>
+      </w:r>
+      <w:proofErr w:type="gramStart"/>
+      <w:r>
+        <w:rPr>
+          <w:rFonts w:hint="eastAsia"/>
+        </w:rPr>
+        <w:t>图为截止层光学匹配半径</w:t>
+      </w:r>
+      <w:r>
+        <w:rPr>
+          <w:rFonts w:hint="eastAsia"/>
+        </w:rPr>
+        <w:t>,(</w:t>
+      </w:r>
+      <w:proofErr w:type="gramEnd"/>
+      <w:r>
+        <w:rPr>
+          <w:rFonts w:hint="eastAsia"/>
+        </w:rPr>
+        <w:t>d)</w:t>
+      </w:r>
+      <w:proofErr w:type="gramStart"/>
+      <w:r>
+        <w:rPr>
+          <w:rFonts w:hint="eastAsia"/>
+        </w:rPr>
+        <w:t>图为天线边缘接收器</w:t>
+      </w:r>
+      <w:r>
+        <w:rPr>
+          <w:rFonts w:hint="eastAsia"/>
+        </w:rPr>
+        <w:t>(</w:t>
+      </w:r>
+      <w:proofErr w:type="gramEnd"/>
+      <w:r>
+        <w:rPr>
+          <w:rFonts w:hint="eastAsia"/>
+        </w:rPr>
+        <w:t xml:space="preserve">z=146 </w:t>
+      </w:r>
+      <w:proofErr w:type="gramStart"/>
+      <w:r>
+        <w:rPr>
+          <w:rFonts w:hint="eastAsia"/>
+        </w:rPr>
+        <w:t>mm)</w:t>
+      </w:r>
+      <w:r>
+        <w:rPr>
+          <w:rFonts w:hint="eastAsia"/>
+        </w:rPr>
+        <w:t>接收光轴在</w:t>
+      </w:r>
+      <w:proofErr w:type="gramEnd"/>
       <w:r>
         <w:rPr>
           <w:rFonts w:hint="eastAsia"/>
         </w:rPr>
         <w:t xml:space="preserve">first lens </w:t>
       </w:r>
-      <w:r>
-        <w:rPr>
-          <w:rFonts w:hint="eastAsia"/>
-        </w:rPr>
-        <w:t>约为</w:t>
-      </w:r>
       <w:proofErr w:type="gramStart"/>
       <w:r>
         <w:rPr>
           <w:rFonts w:hint="eastAsia"/>
         </w:rPr>
-        <w:t>1.57 m</w:t>
+        <w:t>上的高度</w:t>
+      </w:r>
+      <w:r>
+        <w:rPr>
+          <w:rFonts w:hint="eastAsia"/>
+        </w:rPr>
+        <w:t>,first</w:t>
       </w:r>
       <w:proofErr w:type="gramEnd"/>
       <w:r>
         <w:rPr>
           <w:rFonts w:hint="eastAsia"/>
         </w:rPr>
-        <w:t>）处光斑</w:t>
+        <w:t xml:space="preserve"> lens</w:t>
+      </w:r>
+      <w:r>
+        <w:rPr>
+          <w:rFonts w:hint="eastAsia"/>
+        </w:rPr>
+        <w:t>高斯光斑半径如图</w:t>
+      </w:r>
+      <w:r>
+        <w:fldChar w:fldCharType="begin"/>
+      </w:r>
+      <w:r>
+        <w:instrText xml:space="preserve"> </w:instrText>
+      </w:r>
+      <w:r>
+        <w:rPr>
+          <w:rFonts w:hint="eastAsia"/>
+        </w:rPr>
+        <w:instrText>REF _Ref237904841 \h</w:instrText>
+      </w:r>
+      <w:r>
+        <w:instrText xml:space="preserve"> </w:instrText>
+      </w:r>
+      <w:r>
+        <w:fldChar w:fldCharType="separate"/>
+      </w:r>
+      <w:r>
+        <w:t xml:space="preserve">Figure </w:t>
+      </w:r>
+      <w:r>
+        <w:rPr>
+          <w:noProof/>
+        </w:rPr>
+        <w:t>13</w:t>
+      </w:r>
+      <w:r>
+        <w:fldChar w:fldCharType="end"/>
+      </w:r>
+      <w:r>
+        <w:rPr>
+          <w:rFonts w:hint="eastAsia"/>
+        </w:rPr>
+        <w:t>所示。如果</w:t>
+      </w:r>
+      <w:r>
+        <w:rPr>
+          <w:rFonts w:hint="eastAsia"/>
+        </w:rPr>
+        <w:t xml:space="preserve">first lens </w:t>
+      </w:r>
+      <w:r>
+        <w:rPr>
+          <w:rFonts w:hint="eastAsia"/>
+        </w:rPr>
+        <w:t>高度为</w:t>
+      </w:r>
+      <w:r>
+        <w:rPr>
+          <w:rFonts w:hint="eastAsia"/>
+        </w:rPr>
+        <w:t>0.55m</w:t>
+      </w:r>
+      <w:r>
+        <w:rPr>
+          <w:rFonts w:hint="eastAsia"/>
+        </w:rPr>
+        <w:t>，</w:t>
+      </w:r>
+      <w:r>
+        <w:rPr>
+          <w:rFonts w:hint="eastAsia"/>
+        </w:rPr>
+        <w:t xml:space="preserve"> </w:t>
+      </w:r>
+      <w:r>
+        <w:rPr>
+          <w:rFonts w:hint="eastAsia"/>
+        </w:rPr>
+        <w:t>为了保证光路的完整性，有效设置范围限制在</w:t>
+      </w:r>
+      <w:r>
+        <w:fldChar w:fldCharType="begin"/>
+      </w:r>
+      <w:r>
+        <w:instrText xml:space="preserve"> </w:instrText>
+      </w:r>
+      <w:r>
+        <w:rPr>
+          <w:rFonts w:hint="eastAsia"/>
+        </w:rPr>
+        <w:instrText>REF _Ref237903592 \h</w:instrText>
+      </w:r>
+      <w:r>
+        <w:instrText xml:space="preserve"> </w:instrText>
+      </w:r>
+      <w:r>
+        <w:fldChar w:fldCharType="separate"/>
+      </w:r>
+      <w:r>
+        <w:t xml:space="preserve">Figure </w:t>
+      </w:r>
+      <w:r>
+        <w:rPr>
+          <w:noProof/>
+        </w:rPr>
+        <w:t>12</w:t>
+      </w:r>
+      <w:r>
+        <w:fldChar w:fldCharType="end"/>
+      </w:r>
+      <w:r>
+        <w:rPr>
+          <w:rFonts w:hint="eastAsia"/>
+        </w:rPr>
+        <w:t xml:space="preserve"> </w:t>
+      </w:r>
+      <w:r>
+        <w:rPr>
+          <w:rFonts w:hint="eastAsia"/>
+        </w:rPr>
+        <w:t>中黄色区间范围，其光学匹配半径调节范围为</w:t>
+      </w:r>
+      <w:r>
+        <w:rPr>
+          <w:rFonts w:hint="eastAsia"/>
+        </w:rPr>
+        <w:t>R = (0.5 0.</w:t>
       </w:r>
       <w:proofErr w:type="gramStart"/>
       <w:r>
         <w:rPr>
           <w:rFonts w:hint="eastAsia"/>
         </w:rPr>
-        <w:t>半径</w:t>
-      </w:r>
-      <w:r>
-        <w:rPr>
-          <w:rFonts w:hint="eastAsia"/>
-        </w:rPr>
-        <w:t>,(</w:t>
+        <w:t>8)m</w:t>
       </w:r>
       <w:proofErr w:type="gramEnd"/>
       <w:r>
         <w:rPr>
           <w:rFonts w:hint="eastAsia"/>
         </w:rPr>
-        <w:t>b)</w:t>
-      </w:r>
-      <w:r>
-        <w:rPr>
-          <w:rFonts w:hint="eastAsia"/>
-        </w:rPr>
-        <w:t>图为截止层处最大极向接收</w:t>
+        <w:t xml:space="preserve">, </w:t>
       </w:r>
       <w:proofErr w:type="gramStart"/>
       <w:r>
         <w:rPr>
           <w:rFonts w:hint="eastAsia"/>
         </w:rPr>
-        <w:t>高度</w:t>
-      </w:r>
-      <w:r>
-        <w:rPr>
-          <w:rFonts w:hint="eastAsia"/>
-        </w:rPr>
-        <w:t>,(</w:t>
+        <w:t>极向观测范围调节区间为</w:t>
+      </w:r>
+      <w:r>
+        <w:rPr>
+          <w:rFonts w:hint="eastAsia"/>
+        </w:rPr>
+        <w:t>(</w:t>
       </w:r>
       <w:proofErr w:type="gramEnd"/>
       <w:r>
         <w:rPr>
           <w:rFonts w:hint="eastAsia"/>
         </w:rPr>
-        <w:t>c)</w:t>
-      </w:r>
-      <w:r>
-        <w:rPr>
-          <w:rFonts w:hint="eastAsia"/>
-        </w:rPr>
-        <w:t>图为截止层光学匹配</w:t>
+        <w:t>90</w:t>
       </w:r>
       <w:proofErr w:type="gramStart"/>
       <w:r>
         <w:rPr>
           <w:rFonts w:hint="eastAsia"/>
         </w:rPr>
-        <w:t>半径</w:t>
-      </w:r>
-      <w:r>
-        <w:rPr>
-          <w:rFonts w:hint="eastAsia"/>
-        </w:rPr>
-        <w:t>,(</w:t>
+        <w:t>mm  110</w:t>
       </w:r>
       <w:proofErr w:type="gramEnd"/>
       <w:r>
         <w:rPr>
           <w:rFonts w:hint="eastAsia"/>
         </w:rPr>
-        <w:t>d)</w:t>
-      </w:r>
-      <w:r>
-        <w:rPr>
-          <w:rFonts w:hint="eastAsia"/>
-        </w:rPr>
-        <w:t>图为天线边缘接收器</w:t>
+        <w:t>mm</w:t>
       </w:r>
       <w:proofErr w:type="gramStart"/>
       <w:r>
         <w:rPr>
           <w:rFonts w:hint="eastAsia"/>
         </w:rPr>
-        <w:t>(z=146 mm)</w:t>
+        <w:t>),</w:t>
+      </w:r>
+      <w:r>
+        <w:rPr>
+          <w:rFonts w:hint="eastAsia"/>
+        </w:rPr>
+        <w:t>极向光学分辨极限为约为</w:t>
       </w:r>
       <w:proofErr w:type="gramEnd"/>
       <w:r>
         <w:rPr>
           <w:rFonts w:hint="eastAsia"/>
         </w:rPr>
-        <w:t>接收光轴在</w:t>
-      </w:r>
-      <w:r>
-        <w:rPr>
-          <w:rFonts w:hint="eastAsia"/>
-        </w:rPr>
-        <w:t xml:space="preserve">first lens </w:t>
-      </w:r>
-      <w:r>
-        <w:rPr>
-          <w:rFonts w:hint="eastAsia"/>
-        </w:rPr>
-        <w:t>上的高度</w:t>
-      </w:r>
-      <w:r>
-        <w:rPr>
-          <w:rFonts w:hint="eastAsia"/>
-        </w:rPr>
-        <w:t>,first lens</w:t>
-      </w:r>
-      <w:r>
-        <w:rPr>
-          <w:rFonts w:hint="eastAsia"/>
-        </w:rPr>
-        <w:t>高斯光斑半径如图</w:t>
-      </w:r>
-      <w:r>
-        <w:fldChar w:fldCharType="begin"/>
-      </w:r>
-      <w:r>
-        <w:instrText xml:space="preserve"> </w:instrText>
-      </w:r>
-      <w:r>
-        <w:rPr>
-          <w:rFonts w:hint="eastAsia"/>
-        </w:rPr>
-        <w:instrText>REF _Ref237904841 \h</w:instrText>
-      </w:r>
-      <w:r>
-        <w:instrText xml:space="preserve"> </w:instrText>
-      </w:r>
-      <w:r>
-        <w:fldChar w:fldCharType="separate"/>
-      </w:r>
-      <w:r>
-        <w:t xml:space="preserve">Figure </w:t>
-      </w:r>
-      <w:r>
-        <w:rPr>
-          <w:noProof/>
-        </w:rPr>
-        <w:t>13</w:t>
-      </w:r>
-      <w:r>
-        <w:fldChar w:fldCharType="end"/>
-      </w:r>
-      <w:r>
-        <w:rPr>
-          <w:rFonts w:hint="eastAsia"/>
-        </w:rPr>
-        <w:t>所示。如果</w:t>
-      </w:r>
-      <w:r>
-        <w:rPr>
-          <w:rFonts w:hint="eastAsia"/>
-        </w:rPr>
-        <w:t xml:space="preserve">first lens </w:t>
-      </w:r>
-      <w:r>
-        <w:rPr>
-          <w:rFonts w:hint="eastAsia"/>
-        </w:rPr>
-        <w:t>高度为</w:t>
-      </w:r>
-      <w:r>
-        <w:rPr>
-          <w:rFonts w:hint="eastAsia"/>
-        </w:rPr>
-        <w:t>0.55m</w:t>
-      </w:r>
-      <w:proofErr w:type="gramStart"/>
-      <w:r>
-        <w:rPr>
-          <w:rFonts w:hint="eastAsia"/>
-        </w:rPr>
-        <w:t>，</w:t>
-      </w:r>
-      <w:r>
-        <w:rPr>
-          <w:rFonts w:hint="eastAsia"/>
-        </w:rPr>
-        <w:t xml:space="preserve"> </w:t>
-      </w:r>
-      <w:r>
-        <w:rPr>
-          <w:rFonts w:hint="eastAsia"/>
-        </w:rPr>
-        <w:t>为了</w:t>
-      </w:r>
-      <w:proofErr w:type="gramEnd"/>
-      <w:r>
-        <w:rPr>
-          <w:rFonts w:hint="eastAsia"/>
-        </w:rPr>
-        <w:t>保证光路的完整性，有效设置范围限制在</w:t>
-      </w:r>
-      <w:r>
-        <w:fldChar w:fldCharType="begin"/>
-      </w:r>
-      <w:r>
-        <w:instrText xml:space="preserve"> </w:instrText>
-      </w:r>
-      <w:r>
-        <w:rPr>
-          <w:rFonts w:hint="eastAsia"/>
-        </w:rPr>
-        <w:instrText>REF _Ref237903592 \h</w:instrText>
-      </w:r>
-      <w:r>
-        <w:instrText xml:space="preserve"> </w:instrText>
-      </w:r>
-      <w:r>
-        <w:fldChar w:fldCharType="separate"/>
-      </w:r>
-      <w:r>
-        <w:t xml:space="preserve">Figure </w:t>
-      </w:r>
-      <w:r>
-        <w:rPr>
-          <w:noProof/>
-        </w:rPr>
-        <w:t>12</w:t>
-      </w:r>
-      <w:r>
-        <w:fldChar w:fldCharType="end"/>
-      </w:r>
-      <w:r>
-        <w:rPr>
-          <w:rFonts w:hint="eastAsia"/>
-        </w:rPr>
-        <w:t xml:space="preserve"> </w:t>
-      </w:r>
-      <w:r>
-        <w:rPr>
-          <w:rFonts w:hint="eastAsia"/>
-        </w:rPr>
-        <w:t>中黄色区间范围，其光学匹配半径调节范围为</w:t>
-      </w:r>
-      <w:r>
-        <w:rPr>
-          <w:rFonts w:hint="eastAsia"/>
-        </w:rPr>
-        <w:t xml:space="preserve">R = </w:t>
-      </w:r>
-      <w:proofErr w:type="gramStart"/>
-      <w:r>
-        <w:rPr>
-          <w:rFonts w:hint="eastAsia"/>
-        </w:rPr>
-        <w:t>(0.5 0.8)</w:t>
-      </w:r>
-      <w:proofErr w:type="gramEnd"/>
-      <w:r>
-        <w:rPr>
-          <w:rFonts w:hint="eastAsia"/>
-        </w:rPr>
-        <w:t>m</w:t>
-      </w:r>
-      <w:proofErr w:type="gramStart"/>
-      <w:r>
-        <w:rPr>
-          <w:rFonts w:hint="eastAsia"/>
-        </w:rPr>
-        <w:t xml:space="preserve">, </w:t>
-      </w:r>
-      <w:r>
-        <w:rPr>
-          <w:rFonts w:hint="eastAsia"/>
-        </w:rPr>
-        <w:t>极</w:t>
-      </w:r>
-      <w:proofErr w:type="gramEnd"/>
-      <w:r>
-        <w:rPr>
-          <w:rFonts w:hint="eastAsia"/>
-        </w:rPr>
-        <w:t>向观测范围调节区间为</w:t>
-      </w:r>
-      <w:r>
-        <w:rPr>
-          <w:rFonts w:hint="eastAsia"/>
-        </w:rPr>
-        <w:t>(90</w:t>
-      </w:r>
-      <w:proofErr w:type="gramStart"/>
-      <w:r>
-        <w:rPr>
-          <w:rFonts w:hint="eastAsia"/>
-        </w:rPr>
-        <w:t>mm  110</w:t>
-      </w:r>
-      <w:proofErr w:type="gramEnd"/>
-      <w:r>
-        <w:rPr>
-          <w:rFonts w:hint="eastAsia"/>
-        </w:rPr>
-        <w:t>mm),</w:t>
-      </w:r>
-      <w:r>
-        <w:rPr>
-          <w:rFonts w:hint="eastAsia"/>
-        </w:rPr>
-        <w:t>极向光学分辨极限为约为</w:t>
-      </w:r>
-      <w:proofErr w:type="gramStart"/>
-      <w:r>
-        <w:rPr>
-          <w:rFonts w:hint="eastAsia"/>
-        </w:rPr>
         <w:t>16 mm</w:t>
       </w:r>
-      <w:proofErr w:type="gramEnd"/>
       <w:r>
         <w:rPr>
           <w:rFonts w:hint="eastAsia"/>
@@ -3221,7 +3148,7 @@
     </w:p>
     <w:p>
       <w:pPr>
-        <w:pStyle w:val="ae"/>
+        <w:pStyle w:val="Caption"/>
         <w:jc w:val="center"/>
       </w:pPr>
       <w:bookmarkStart w:id="8" w:name="_Ref237904841"/>
@@ -3255,18 +3182,12 @@
         </w:rPr>
         <w:t>first lens</w:t>
       </w:r>
-      <w:r>
-        <w:rPr>
-          <w:rFonts w:hint="eastAsia"/>
-        </w:rPr>
-        <w:t>上高斯光斑</w:t>
-      </w:r>
       <w:proofErr w:type="gramStart"/>
       <w:r>
         <w:rPr>
           <w:rFonts w:hint="eastAsia"/>
         </w:rPr>
-        <w:t>半径</w:t>
+        <w:t>上高斯光斑半径</w:t>
       </w:r>
       <w:r>
         <w:rPr>
@@ -3274,18 +3195,32 @@
         </w:rPr>
         <w:t>,</w:t>
       </w:r>
+      <w:r>
+        <w:rPr>
+          <w:rFonts w:hint="eastAsia"/>
+        </w:rPr>
+        <w:t>接收天线处等效高斯半径</w:t>
+      </w:r>
       <w:proofErr w:type="gramEnd"/>
       <w:r>
         <w:rPr>
           <w:rFonts w:hint="eastAsia"/>
         </w:rPr>
-        <w:t>接收天线处等效高斯半径</w:t>
-      </w:r>
-      <w:r>
-        <w:rPr>
-          <w:rFonts w:hint="eastAsia"/>
-        </w:rPr>
-        <w:t>w0 =22mm,lambda0=4mm</w:t>
+        <w:t>w0 =22</w:t>
+      </w:r>
+      <w:proofErr w:type="gramStart"/>
+      <w:r>
+        <w:rPr>
+          <w:rFonts w:hint="eastAsia"/>
+        </w:rPr>
+        <w:t>mm,lambda</w:t>
+      </w:r>
+      <w:proofErr w:type="gramEnd"/>
+      <w:r>
+        <w:rPr>
+          <w:rFonts w:hint="eastAsia"/>
+        </w:rPr>
+        <w:t>0=4mm</w:t>
       </w:r>
     </w:p>
     <w:p>
@@ -3377,7 +3312,7 @@
     </w:p>
     <w:p>
       <w:pPr>
-        <w:pStyle w:val="ae"/>
+        <w:pStyle w:val="Caption"/>
         <w:jc w:val="center"/>
       </w:pPr>
       <w:r>
@@ -3403,6 +3338,29 @@
         </w:rPr>
         <w:t>接收光路三维视图</w:t>
       </w:r>
+    </w:p>
+    <w:p/>
+    <w:p>
+      <w:r>
+        <w:rPr>
+          <w:rFonts w:hint="eastAsia"/>
+        </w:rPr>
+        <w:lastRenderedPageBreak/>
+        <w:t>发射光路设计：</w:t>
+      </w:r>
+    </w:p>
+    <w:p/>
+    <w:p/>
+    <w:p/>
+    <w:p/>
+    <w:p/>
+    <w:p/>
+    <w:p>
+      <w:pPr>
+        <w:rPr>
+          <w:rFonts w:hint="eastAsia"/>
+        </w:rPr>
+      </w:pPr>
     </w:p>
     <w:sectPr>
       <w:pgSz w:w="12240" w:h="15840"/>
@@ -4000,7 +3958,7 @@
     <w:lsdException w:name="Unresolved Mention" w:semiHidden="1" w:unhideWhenUsed="1"/>
     <w:lsdException w:name="Smart Link" w:semiHidden="1" w:unhideWhenUsed="1"/>
   </w:latentStyles>
-  <w:style w:type="paragraph" w:default="1" w:styleId="a">
+  <w:style w:type="paragraph" w:default="1" w:styleId="Normal">
     <w:name w:val="Normal"/>
     <w:qFormat/>
     <w:rsid w:val="002200A5"/>
@@ -4009,11 +3967,11 @@
       <w14:ligatures w14:val="none"/>
     </w:rPr>
   </w:style>
-  <w:style w:type="paragraph" w:styleId="1">
+  <w:style w:type="paragraph" w:styleId="Heading1">
     <w:name w:val="heading 1"/>
-    <w:basedOn w:val="a"/>
-    <w:next w:val="a"/>
-    <w:link w:val="10"/>
+    <w:basedOn w:val="Normal"/>
+    <w:next w:val="Normal"/>
+    <w:link w:val="Heading1Char"/>
     <w:uiPriority w:val="9"/>
     <w:qFormat/>
     <w:rsid w:val="002200A5"/>
@@ -4030,11 +3988,11 @@
       <w:szCs w:val="48"/>
     </w:rPr>
   </w:style>
-  <w:style w:type="paragraph" w:styleId="2">
+  <w:style w:type="paragraph" w:styleId="Heading2">
     <w:name w:val="heading 2"/>
-    <w:basedOn w:val="a"/>
-    <w:next w:val="a"/>
-    <w:link w:val="20"/>
+    <w:basedOn w:val="Normal"/>
+    <w:next w:val="Normal"/>
+    <w:link w:val="Heading2Char"/>
     <w:uiPriority w:val="9"/>
     <w:semiHidden/>
     <w:unhideWhenUsed/>
@@ -4053,11 +4011,11 @@
       <w:szCs w:val="40"/>
     </w:rPr>
   </w:style>
-  <w:style w:type="paragraph" w:styleId="3">
+  <w:style w:type="paragraph" w:styleId="Heading3">
     <w:name w:val="heading 3"/>
-    <w:basedOn w:val="a"/>
-    <w:next w:val="a"/>
-    <w:link w:val="30"/>
+    <w:basedOn w:val="Normal"/>
+    <w:next w:val="Normal"/>
+    <w:link w:val="Heading3Char"/>
     <w:uiPriority w:val="9"/>
     <w:semiHidden/>
     <w:unhideWhenUsed/>
@@ -4076,11 +4034,11 @@
       <w:szCs w:val="32"/>
     </w:rPr>
   </w:style>
-  <w:style w:type="paragraph" w:styleId="4">
+  <w:style w:type="paragraph" w:styleId="Heading4">
     <w:name w:val="heading 4"/>
-    <w:basedOn w:val="a"/>
-    <w:next w:val="a"/>
-    <w:link w:val="40"/>
+    <w:basedOn w:val="Normal"/>
+    <w:next w:val="Normal"/>
+    <w:link w:val="Heading4Char"/>
     <w:uiPriority w:val="9"/>
     <w:semiHidden/>
     <w:unhideWhenUsed/>
@@ -4099,11 +4057,11 @@
       <w:szCs w:val="28"/>
     </w:rPr>
   </w:style>
-  <w:style w:type="paragraph" w:styleId="5">
+  <w:style w:type="paragraph" w:styleId="Heading5">
     <w:name w:val="heading 5"/>
-    <w:basedOn w:val="a"/>
-    <w:next w:val="a"/>
-    <w:link w:val="50"/>
+    <w:basedOn w:val="Normal"/>
+    <w:next w:val="Normal"/>
+    <w:link w:val="Heading5Char"/>
     <w:uiPriority w:val="9"/>
     <w:semiHidden/>
     <w:unhideWhenUsed/>
@@ -4122,11 +4080,11 @@
       <w:szCs w:val="24"/>
     </w:rPr>
   </w:style>
-  <w:style w:type="paragraph" w:styleId="6">
+  <w:style w:type="paragraph" w:styleId="Heading6">
     <w:name w:val="heading 6"/>
-    <w:basedOn w:val="a"/>
-    <w:next w:val="a"/>
-    <w:link w:val="60"/>
+    <w:basedOn w:val="Normal"/>
+    <w:next w:val="Normal"/>
+    <w:link w:val="Heading6Char"/>
     <w:uiPriority w:val="9"/>
     <w:semiHidden/>
     <w:unhideWhenUsed/>
@@ -4145,11 +4103,11 @@
       <w:color w:val="0F4761" w:themeColor="accent1" w:themeShade="BF"/>
     </w:rPr>
   </w:style>
-  <w:style w:type="paragraph" w:styleId="7">
+  <w:style w:type="paragraph" w:styleId="Heading7">
     <w:name w:val="heading 7"/>
-    <w:basedOn w:val="a"/>
-    <w:next w:val="a"/>
-    <w:link w:val="70"/>
+    <w:basedOn w:val="Normal"/>
+    <w:next w:val="Normal"/>
+    <w:link w:val="Heading7Char"/>
     <w:uiPriority w:val="9"/>
     <w:semiHidden/>
     <w:unhideWhenUsed/>
@@ -4168,11 +4126,11 @@
       <w:color w:val="595959" w:themeColor="text1" w:themeTint="A6"/>
     </w:rPr>
   </w:style>
-  <w:style w:type="paragraph" w:styleId="8">
+  <w:style w:type="paragraph" w:styleId="Heading8">
     <w:name w:val="heading 8"/>
-    <w:basedOn w:val="a"/>
-    <w:next w:val="a"/>
-    <w:link w:val="80"/>
+    <w:basedOn w:val="Normal"/>
+    <w:next w:val="Normal"/>
+    <w:link w:val="Heading8Char"/>
     <w:uiPriority w:val="9"/>
     <w:semiHidden/>
     <w:unhideWhenUsed/>
@@ -4189,11 +4147,11 @@
       <w:color w:val="595959" w:themeColor="text1" w:themeTint="A6"/>
     </w:rPr>
   </w:style>
-  <w:style w:type="paragraph" w:styleId="9">
+  <w:style w:type="paragraph" w:styleId="Heading9">
     <w:name w:val="heading 9"/>
-    <w:basedOn w:val="a"/>
-    <w:next w:val="a"/>
-    <w:link w:val="90"/>
+    <w:basedOn w:val="Normal"/>
+    <w:next w:val="Normal"/>
+    <w:link w:val="Heading9Char"/>
     <w:uiPriority w:val="9"/>
     <w:semiHidden/>
     <w:unhideWhenUsed/>
@@ -4210,13 +4168,13 @@
       <w:color w:val="595959" w:themeColor="text1" w:themeTint="A6"/>
     </w:rPr>
   </w:style>
-  <w:style w:type="character" w:default="1" w:styleId="a0">
+  <w:style w:type="character" w:default="1" w:styleId="DefaultParagraphFont">
     <w:name w:val="Default Paragraph Font"/>
     <w:uiPriority w:val="1"/>
     <w:semiHidden/>
     <w:unhideWhenUsed/>
   </w:style>
-  <w:style w:type="table" w:default="1" w:styleId="a1">
+  <w:style w:type="table" w:default="1" w:styleId="TableNormal">
     <w:name w:val="Normal Table"/>
     <w:uiPriority w:val="99"/>
     <w:semiHidden/>
@@ -4231,16 +4189,16 @@
       </w:tblCellMar>
     </w:tblPr>
   </w:style>
-  <w:style w:type="numbering" w:default="1" w:styleId="a2">
+  <w:style w:type="numbering" w:default="1" w:styleId="NoList">
     <w:name w:val="No List"/>
     <w:uiPriority w:val="99"/>
     <w:semiHidden/>
     <w:unhideWhenUsed/>
   </w:style>
-  <w:style w:type="character" w:customStyle="1" w:styleId="10">
-    <w:name w:val="标题 1 字符"/>
-    <w:basedOn w:val="a0"/>
-    <w:link w:val="1"/>
+  <w:style w:type="character" w:customStyle="1" w:styleId="Heading1Char">
+    <w:name w:val="Heading 1 Char"/>
+    <w:basedOn w:val="DefaultParagraphFont"/>
+    <w:link w:val="Heading1"/>
     <w:uiPriority w:val="9"/>
     <w:rsid w:val="002200A5"/>
     <w:rPr>
@@ -4250,10 +4208,10 @@
       <w:szCs w:val="48"/>
     </w:rPr>
   </w:style>
-  <w:style w:type="character" w:customStyle="1" w:styleId="20">
-    <w:name w:val="标题 2 字符"/>
-    <w:basedOn w:val="a0"/>
-    <w:link w:val="2"/>
+  <w:style w:type="character" w:customStyle="1" w:styleId="Heading2Char">
+    <w:name w:val="Heading 2 Char"/>
+    <w:basedOn w:val="DefaultParagraphFont"/>
+    <w:link w:val="Heading2"/>
     <w:uiPriority w:val="9"/>
     <w:semiHidden/>
     <w:rsid w:val="002200A5"/>
@@ -4264,10 +4222,10 @@
       <w:szCs w:val="40"/>
     </w:rPr>
   </w:style>
-  <w:style w:type="character" w:customStyle="1" w:styleId="30">
-    <w:name w:val="标题 3 字符"/>
-    <w:basedOn w:val="a0"/>
-    <w:link w:val="3"/>
+  <w:style w:type="character" w:customStyle="1" w:styleId="Heading3Char">
+    <w:name w:val="Heading 3 Char"/>
+    <w:basedOn w:val="DefaultParagraphFont"/>
+    <w:link w:val="Heading3"/>
     <w:uiPriority w:val="9"/>
     <w:semiHidden/>
     <w:rsid w:val="002200A5"/>
@@ -4278,10 +4236,10 @@
       <w:szCs w:val="32"/>
     </w:rPr>
   </w:style>
-  <w:style w:type="character" w:customStyle="1" w:styleId="40">
-    <w:name w:val="标题 4 字符"/>
-    <w:basedOn w:val="a0"/>
-    <w:link w:val="4"/>
+  <w:style w:type="character" w:customStyle="1" w:styleId="Heading4Char">
+    <w:name w:val="Heading 4 Char"/>
+    <w:basedOn w:val="DefaultParagraphFont"/>
+    <w:link w:val="Heading4"/>
     <w:uiPriority w:val="9"/>
     <w:semiHidden/>
     <w:rsid w:val="002200A5"/>
@@ -4292,10 +4250,10 @@
       <w:szCs w:val="28"/>
     </w:rPr>
   </w:style>
-  <w:style w:type="character" w:customStyle="1" w:styleId="50">
-    <w:name w:val="标题 5 字符"/>
-    <w:basedOn w:val="a0"/>
-    <w:link w:val="5"/>
+  <w:style w:type="character" w:customStyle="1" w:styleId="Heading5Char">
+    <w:name w:val="Heading 5 Char"/>
+    <w:basedOn w:val="DefaultParagraphFont"/>
+    <w:link w:val="Heading5"/>
     <w:uiPriority w:val="9"/>
     <w:semiHidden/>
     <w:rsid w:val="002200A5"/>
@@ -4306,10 +4264,10 @@
       <w:szCs w:val="24"/>
     </w:rPr>
   </w:style>
-  <w:style w:type="character" w:customStyle="1" w:styleId="60">
-    <w:name w:val="标题 6 字符"/>
-    <w:basedOn w:val="a0"/>
-    <w:link w:val="6"/>
+  <w:style w:type="character" w:customStyle="1" w:styleId="Heading6Char">
+    <w:name w:val="Heading 6 Char"/>
+    <w:basedOn w:val="DefaultParagraphFont"/>
+    <w:link w:val="Heading6"/>
     <w:uiPriority w:val="9"/>
     <w:semiHidden/>
     <w:rsid w:val="002200A5"/>
@@ -4320,10 +4278,10 @@
       <w:color w:val="0F4761" w:themeColor="accent1" w:themeShade="BF"/>
     </w:rPr>
   </w:style>
-  <w:style w:type="character" w:customStyle="1" w:styleId="70">
-    <w:name w:val="标题 7 字符"/>
-    <w:basedOn w:val="a0"/>
-    <w:link w:val="7"/>
+  <w:style w:type="character" w:customStyle="1" w:styleId="Heading7Char">
+    <w:name w:val="Heading 7 Char"/>
+    <w:basedOn w:val="DefaultParagraphFont"/>
+    <w:link w:val="Heading7"/>
     <w:uiPriority w:val="9"/>
     <w:semiHidden/>
     <w:rsid w:val="002200A5"/>
@@ -4334,10 +4292,10 @@
       <w:color w:val="595959" w:themeColor="text1" w:themeTint="A6"/>
     </w:rPr>
   </w:style>
-  <w:style w:type="character" w:customStyle="1" w:styleId="80">
-    <w:name w:val="标题 8 字符"/>
-    <w:basedOn w:val="a0"/>
-    <w:link w:val="8"/>
+  <w:style w:type="character" w:customStyle="1" w:styleId="Heading8Char">
+    <w:name w:val="Heading 8 Char"/>
+    <w:basedOn w:val="DefaultParagraphFont"/>
+    <w:link w:val="Heading8"/>
     <w:uiPriority w:val="9"/>
     <w:semiHidden/>
     <w:rsid w:val="002200A5"/>
@@ -4346,10 +4304,10 @@
       <w:color w:val="595959" w:themeColor="text1" w:themeTint="A6"/>
     </w:rPr>
   </w:style>
-  <w:style w:type="character" w:customStyle="1" w:styleId="90">
-    <w:name w:val="标题 9 字符"/>
-    <w:basedOn w:val="a0"/>
-    <w:link w:val="9"/>
+  <w:style w:type="character" w:customStyle="1" w:styleId="Heading9Char">
+    <w:name w:val="Heading 9 Char"/>
+    <w:basedOn w:val="DefaultParagraphFont"/>
+    <w:link w:val="Heading9"/>
     <w:uiPriority w:val="9"/>
     <w:semiHidden/>
     <w:rsid w:val="002200A5"/>
@@ -4358,11 +4316,11 @@
       <w:color w:val="595959" w:themeColor="text1" w:themeTint="A6"/>
     </w:rPr>
   </w:style>
-  <w:style w:type="paragraph" w:styleId="a3">
+  <w:style w:type="paragraph" w:styleId="Title">
     <w:name w:val="Title"/>
-    <w:basedOn w:val="a"/>
-    <w:next w:val="a"/>
-    <w:link w:val="a4"/>
+    <w:basedOn w:val="Normal"/>
+    <w:next w:val="Normal"/>
+    <w:link w:val="TitleChar"/>
     <w:uiPriority w:val="10"/>
     <w:qFormat/>
     <w:rsid w:val="002200A5"/>
@@ -4379,10 +4337,10 @@
       <w:szCs w:val="56"/>
     </w:rPr>
   </w:style>
-  <w:style w:type="character" w:customStyle="1" w:styleId="a4">
-    <w:name w:val="标题 字符"/>
-    <w:basedOn w:val="a0"/>
-    <w:link w:val="a3"/>
+  <w:style w:type="character" w:customStyle="1" w:styleId="TitleChar">
+    <w:name w:val="Title Char"/>
+    <w:basedOn w:val="DefaultParagraphFont"/>
+    <w:link w:val="Title"/>
     <w:uiPriority w:val="10"/>
     <w:rsid w:val="002200A5"/>
     <w:rPr>
@@ -4393,11 +4351,11 @@
       <w:szCs w:val="56"/>
     </w:rPr>
   </w:style>
-  <w:style w:type="paragraph" w:styleId="a5">
+  <w:style w:type="paragraph" w:styleId="Subtitle">
     <w:name w:val="Subtitle"/>
-    <w:basedOn w:val="a"/>
-    <w:next w:val="a"/>
-    <w:link w:val="a6"/>
+    <w:basedOn w:val="Normal"/>
+    <w:next w:val="Normal"/>
+    <w:link w:val="SubtitleChar"/>
     <w:uiPriority w:val="11"/>
     <w:qFormat/>
     <w:rsid w:val="002200A5"/>
@@ -4415,10 +4373,10 @@
       <w:szCs w:val="28"/>
     </w:rPr>
   </w:style>
-  <w:style w:type="character" w:customStyle="1" w:styleId="a6">
-    <w:name w:val="副标题 字符"/>
-    <w:basedOn w:val="a0"/>
-    <w:link w:val="a5"/>
+  <w:style w:type="character" w:customStyle="1" w:styleId="SubtitleChar">
+    <w:name w:val="Subtitle Char"/>
+    <w:basedOn w:val="DefaultParagraphFont"/>
+    <w:link w:val="Subtitle"/>
     <w:uiPriority w:val="11"/>
     <w:rsid w:val="002200A5"/>
     <w:rPr>
@@ -4429,11 +4387,11 @@
       <w:szCs w:val="28"/>
     </w:rPr>
   </w:style>
-  <w:style w:type="paragraph" w:styleId="a7">
+  <w:style w:type="paragraph" w:styleId="Quote">
     <w:name w:val="Quote"/>
-    <w:basedOn w:val="a"/>
-    <w:next w:val="a"/>
-    <w:link w:val="a8"/>
+    <w:basedOn w:val="Normal"/>
+    <w:next w:val="Normal"/>
+    <w:link w:val="QuoteChar"/>
     <w:uiPriority w:val="29"/>
     <w:qFormat/>
     <w:rsid w:val="002200A5"/>
@@ -4447,10 +4405,10 @@
       <w:color w:val="404040" w:themeColor="text1" w:themeTint="BF"/>
     </w:rPr>
   </w:style>
-  <w:style w:type="character" w:customStyle="1" w:styleId="a8">
-    <w:name w:val="引用 字符"/>
-    <w:basedOn w:val="a0"/>
-    <w:link w:val="a7"/>
+  <w:style w:type="character" w:customStyle="1" w:styleId="QuoteChar">
+    <w:name w:val="Quote Char"/>
+    <w:basedOn w:val="DefaultParagraphFont"/>
+    <w:link w:val="Quote"/>
     <w:uiPriority w:val="29"/>
     <w:rsid w:val="002200A5"/>
     <w:rPr>
@@ -4459,9 +4417,9 @@
       <w:color w:val="404040" w:themeColor="text1" w:themeTint="BF"/>
     </w:rPr>
   </w:style>
-  <w:style w:type="paragraph" w:styleId="a9">
+  <w:style w:type="paragraph" w:styleId="ListParagraph">
     <w:name w:val="List Paragraph"/>
-    <w:basedOn w:val="a"/>
+    <w:basedOn w:val="Normal"/>
     <w:uiPriority w:val="34"/>
     <w:qFormat/>
     <w:rsid w:val="002200A5"/>
@@ -4470,9 +4428,9 @@
       <w:contextualSpacing/>
     </w:pPr>
   </w:style>
-  <w:style w:type="character" w:styleId="aa">
+  <w:style w:type="character" w:styleId="IntenseEmphasis">
     <w:name w:val="Intense Emphasis"/>
-    <w:basedOn w:val="a0"/>
+    <w:basedOn w:val="DefaultParagraphFont"/>
     <w:uiPriority w:val="21"/>
     <w:qFormat/>
     <w:rsid w:val="002200A5"/>
@@ -4482,11 +4440,11 @@
       <w:color w:val="0F4761" w:themeColor="accent1" w:themeShade="BF"/>
     </w:rPr>
   </w:style>
-  <w:style w:type="paragraph" w:styleId="ab">
+  <w:style w:type="paragraph" w:styleId="IntenseQuote">
     <w:name w:val="Intense Quote"/>
-    <w:basedOn w:val="a"/>
-    <w:next w:val="a"/>
-    <w:link w:val="ac"/>
+    <w:basedOn w:val="Normal"/>
+    <w:next w:val="Normal"/>
+    <w:link w:val="IntenseQuoteChar"/>
     <w:uiPriority w:val="30"/>
     <w:qFormat/>
     <w:rsid w:val="002200A5"/>
@@ -4505,10 +4463,10 @@
       <w:color w:val="0F4761" w:themeColor="accent1" w:themeShade="BF"/>
     </w:rPr>
   </w:style>
-  <w:style w:type="character" w:customStyle="1" w:styleId="ac">
-    <w:name w:val="明显引用 字符"/>
-    <w:basedOn w:val="a0"/>
-    <w:link w:val="ab"/>
+  <w:style w:type="character" w:customStyle="1" w:styleId="IntenseQuoteChar">
+    <w:name w:val="Intense Quote Char"/>
+    <w:basedOn w:val="DefaultParagraphFont"/>
+    <w:link w:val="IntenseQuote"/>
     <w:uiPriority w:val="30"/>
     <w:rsid w:val="002200A5"/>
     <w:rPr>
@@ -4517,9 +4475,9 @@
       <w:color w:val="0F4761" w:themeColor="accent1" w:themeShade="BF"/>
     </w:rPr>
   </w:style>
-  <w:style w:type="character" w:styleId="ad">
+  <w:style w:type="character" w:styleId="IntenseReference">
     <w:name w:val="Intense Reference"/>
-    <w:basedOn w:val="a0"/>
+    <w:basedOn w:val="DefaultParagraphFont"/>
     <w:uiPriority w:val="32"/>
     <w:qFormat/>
     <w:rsid w:val="002200A5"/>
@@ -4531,10 +4489,10 @@
       <w:spacing w:val="5"/>
     </w:rPr>
   </w:style>
-  <w:style w:type="paragraph" w:styleId="ae">
+  <w:style w:type="paragraph" w:styleId="Caption">
     <w:name w:val="caption"/>
-    <w:basedOn w:val="a"/>
-    <w:next w:val="a"/>
+    <w:basedOn w:val="Normal"/>
+    <w:next w:val="Normal"/>
     <w:uiPriority w:val="35"/>
     <w:unhideWhenUsed/>
     <w:qFormat/>

</xml_diff>